<commit_message>
chore(assets): reemplazar Call for Abstract y Plantilla Resumen con versiones actualizadas
Co-Authored-By: Claude Sonnet 4.6 <noreply@anthropic.com>
</commit_message>
<xml_diff>
--- a/backend/public/docs/Plantilla_Resumen.docx
+++ b/backend/public/docs/Plantilla_Resumen.docx
@@ -190,41 +190,6 @@
               <w:lang w:val="es-ES_tradnl"/>
             </w:rPr>
             <w:t>3</w:t>
-          </w:r>
-        </w:p>
-        <w:p>
-          <w:pPr>
-            <w:pStyle w:val="Autores"/>
-            <w:spacing w:before="0"/>
-            <w:rPr>
-              <w:rFonts w:ascii="Spranq eco sans" w:hAnsi="Spranq eco sans"/>
-              <w:sz w:val="20"/>
-              <w:lang w:eastAsia="en-US"/>
-            </w:rPr>
-          </w:pPr>
-          <w:r>
-            <w:rPr>
-              <w:rFonts w:ascii="Spranq eco sans" w:hAnsi="Spranq eco sans"/>
-              <w:sz w:val="20"/>
-              <w:lang w:eastAsia="en-US"/>
-            </w:rPr>
-            <w:t>[</w:t>
-          </w:r>
-          <w:r>
-            <w:rPr>
-              <w:rFonts w:ascii="Spranq eco sans" w:hAnsi="Spranq eco sans"/>
-              <w:sz w:val="20"/>
-              <w:lang w:eastAsia="en-US"/>
-            </w:rPr>
-            <w:t>Las ponencias propuestas no deberán tener más de tres autores</w:t>
-          </w:r>
-          <w:r>
-            <w:rPr>
-              <w:rFonts w:ascii="Spranq eco sans" w:hAnsi="Spranq eco sans"/>
-              <w:sz w:val="20"/>
-              <w:lang w:eastAsia="en-US"/>
-            </w:rPr>
-            <w:t>]</w:t>
           </w:r>
         </w:p>
         <w:p>
@@ -401,6 +366,8 @@
         </w:rPr>
         <w:t xml:space="preserve"> </w:t>
       </w:r>
+      <w:bookmarkStart w:id="0" w:name="_GoBack"/>
+      <w:bookmarkEnd w:id="0"/>
     </w:p>
     <w:sdt>
       <w:sdtPr>
@@ -638,6 +605,7 @@
           <w:docPart w:val="174325CFE1314778818037A1548ED50D"/>
         </w:placeholder>
       </w:sdtPr>
+      <w:sdtEndPr/>
       <w:sdtContent>
         <w:p>
           <w:pPr>
@@ -783,8 +751,6 @@
           <w:sz w:val="20"/>
         </w:rPr>
       </w:pPr>
-      <w:bookmarkStart w:id="0" w:name="_GoBack"/>
-      <w:bookmarkEnd w:id="0"/>
     </w:p>
     <w:p>
       <w:pPr>
@@ -2635,7 +2601,7 @@
     <w:charset w:val="00"/>
     <w:family w:val="roman"/>
     <w:pitch w:val="variable"/>
-    <w:sig w:usb0="E0002AFF" w:usb1="C0007843" w:usb2="00000009" w:usb3="00000000" w:csb0="000001FF" w:csb1="00000000"/>
+    <w:sig w:usb0="E0002EFF" w:usb1="C000785B" w:usb2="00000009" w:usb3="00000000" w:csb0="000001FF" w:csb1="00000000"/>
   </w:font>
   <w:font w:name="Aptos Display">
     <w:altName w:val="Calibri"/>
@@ -2664,21 +2630,21 @@
     <w:charset w:val="00"/>
     <w:family w:val="swiss"/>
     <w:pitch w:val="variable"/>
-    <w:sig w:usb0="E0002AFF" w:usb1="C0007843" w:usb2="00000009" w:usb3="00000000" w:csb0="000001FF" w:csb1="00000000"/>
+    <w:sig w:usb0="E0002EFF" w:usb1="C000785B" w:usb2="00000009" w:usb3="00000000" w:csb0="000001FF" w:csb1="00000000"/>
   </w:font>
   <w:font w:name="Calibri">
     <w:panose1 w:val="020F0502020204030204"/>
     <w:charset w:val="00"/>
     <w:family w:val="swiss"/>
     <w:pitch w:val="variable"/>
-    <w:sig w:usb0="E0002AFF" w:usb1="4000ACFF" w:usb2="00000001" w:usb3="00000000" w:csb0="000001FF" w:csb1="00000000"/>
+    <w:sig w:usb0="E4002EFF" w:usb1="C200247B" w:usb2="00000009" w:usb3="00000000" w:csb0="000001FF" w:csb1="00000000"/>
   </w:font>
   <w:font w:name="Calibri Light">
     <w:panose1 w:val="020F0302020204030204"/>
     <w:charset w:val="00"/>
     <w:family w:val="swiss"/>
     <w:pitch w:val="variable"/>
-    <w:sig w:usb0="A0002AEF" w:usb1="4000207B" w:usb2="00000000" w:usb3="00000000" w:csb0="000001FF" w:csb1="00000000"/>
+    <w:sig w:usb0="E4002EFF" w:usb1="C200247B" w:usb2="00000009" w:usb3="00000000" w:csb0="000001FF" w:csb1="00000000"/>
   </w:font>
 </w:fonts>
 </file>
@@ -2701,6 +2667,7 @@
   <w:rsids>
     <w:rsidRoot w:val="005F02F0"/>
     <w:rsid w:val="005F02F0"/>
+    <w:rsid w:val="00977B7D"/>
   </w:rsids>
   <m:mathPr>
     <m:mathFont m:val="Cambria Math"/>
@@ -3484,6 +3451,25 @@
 </file>
 
 <file path=customXml/item1.xml><?xml version="1.0" encoding="utf-8"?>
+<p:properties xmlns:p="http://schemas.microsoft.com/office/2006/metadata/properties" xmlns:xsi="http://www.w3.org/2001/XMLSchema-instance" xmlns:pc="http://schemas.microsoft.com/office/infopath/2007/PartnerControls">
+  <documentManagement>
+    <_ip_UnifiedCompliancePolicyUIAction xmlns="http://schemas.microsoft.com/sharepoint/v3" xsi:nil="true"/>
+    <_activity xmlns="475903d6-5b88-4d7a-ba78-d123e191ef42" xsi:nil="true"/>
+    <_ip_UnifiedCompliancePolicyProperties xmlns="http://schemas.microsoft.com/sharepoint/v3" xsi:nil="true"/>
+  </documentManagement>
+</p:properties>
+</file>
+
+<file path=customXml/item2.xml><?xml version="1.0" encoding="utf-8"?>
+<?mso-contentType ?>
+<FormTemplates xmlns="http://schemas.microsoft.com/sharepoint/v3/contenttype/forms">
+  <Display>DocumentLibraryForm</Display>
+  <Edit>DocumentLibraryForm</Edit>
+  <New>DocumentLibraryForm</New>
+</FormTemplates>
+</file>
+
+<file path=customXml/item3.xml><?xml version="1.0" encoding="utf-8"?>
 <ct:contentTypeSchema xmlns:ct="http://schemas.microsoft.com/office/2006/metadata/contentType" xmlns:ma="http://schemas.microsoft.com/office/2006/metadata/properties/metaAttributes" ct:_="" ma:_="" ma:contentTypeName="Document" ma:contentTypeID="0x01010007385DC504DB614DA8F67D4315A28B14" ma:contentTypeVersion="20" ma:contentTypeDescription="Create a new document." ma:contentTypeScope="" ma:versionID="c426cb2dd182a672844e09502869c0a7">
   <xsd:schema xmlns:xsd="http://www.w3.org/2001/XMLSchema" xmlns:xs="http://www.w3.org/2001/XMLSchema" xmlns:p="http://schemas.microsoft.com/office/2006/metadata/properties" xmlns:ns1="http://schemas.microsoft.com/sharepoint/v3" xmlns:ns3="1be38a3c-13c4-46e0-8a29-91f320e906cc" xmlns:ns4="475903d6-5b88-4d7a-ba78-d123e191ef42" targetNamespace="http://schemas.microsoft.com/office/2006/metadata/properties" ma:root="true" ma:fieldsID="29a8cc9863e396462b5258e8420a9ac8" ns1:_="" ns3:_="" ns4:_="">
     <xsd:import namespace="http://schemas.microsoft.com/sharepoint/v3"/>
@@ -3753,30 +3739,37 @@
 </ct:contentTypeSchema>
 </file>
 
-<file path=customXml/item2.xml><?xml version="1.0" encoding="utf-8"?>
-<?mso-contentType ?>
-<FormTemplates xmlns="http://schemas.microsoft.com/sharepoint/v3/contenttype/forms">
-  <Display>DocumentLibraryForm</Display>
-  <Edit>DocumentLibraryForm</Edit>
-  <New>DocumentLibraryForm</New>
-</FormTemplates>
-</file>
-
-<file path=customXml/item3.xml><?xml version="1.0" encoding="utf-8"?>
-<p:properties xmlns:p="http://schemas.microsoft.com/office/2006/metadata/properties" xmlns:xsi="http://www.w3.org/2001/XMLSchema-instance" xmlns:pc="http://schemas.microsoft.com/office/infopath/2007/PartnerControls">
-  <documentManagement>
-    <_ip_UnifiedCompliancePolicyUIAction xmlns="http://schemas.microsoft.com/sharepoint/v3" xsi:nil="true"/>
-    <_activity xmlns="475903d6-5b88-4d7a-ba78-d123e191ef42" xsi:nil="true"/>
-    <_ip_UnifiedCompliancePolicyProperties xmlns="http://schemas.microsoft.com/sharepoint/v3" xsi:nil="true"/>
-  </documentManagement>
-</p:properties>
-</file>
-
 <file path=customXml/item4.xml><?xml version="1.0" encoding="utf-8"?>
 <b:Sources xmlns:b="http://schemas.openxmlformats.org/officeDocument/2006/bibliography" xmlns="http://schemas.openxmlformats.org/officeDocument/2006/bibliography" SelectedStyle="/APASixthEditionOfficeOnline.xsl" StyleName="APA" Version="6"/>
 </file>
 
 <file path=customXml/itemProps1.xml><?xml version="1.0" encoding="utf-8"?>
+<ds:datastoreItem xmlns:ds="http://schemas.openxmlformats.org/officeDocument/2006/customXml" ds:itemID="{15B5EAE2-45C9-4001-88A9-4176EEA675B4}">
+  <ds:schemaRefs>
+    <ds:schemaRef ds:uri="http://www.w3.org/XML/1998/namespace"/>
+    <ds:schemaRef ds:uri="http://purl.org/dc/terms/"/>
+    <ds:schemaRef ds:uri="1be38a3c-13c4-46e0-8a29-91f320e906cc"/>
+    <ds:schemaRef ds:uri="http://schemas.microsoft.com/office/infopath/2007/PartnerControls"/>
+    <ds:schemaRef ds:uri="http://schemas.microsoft.com/sharepoint/v3"/>
+    <ds:schemaRef ds:uri="http://schemas.microsoft.com/office/2006/metadata/properties"/>
+    <ds:schemaRef ds:uri="http://purl.org/dc/elements/1.1/"/>
+    <ds:schemaRef ds:uri="http://schemas.microsoft.com/office/2006/documentManagement/types"/>
+    <ds:schemaRef ds:uri="http://schemas.openxmlformats.org/package/2006/metadata/core-properties"/>
+    <ds:schemaRef ds:uri="475903d6-5b88-4d7a-ba78-d123e191ef42"/>
+    <ds:schemaRef ds:uri="http://purl.org/dc/dcmitype/"/>
+  </ds:schemaRefs>
+</ds:datastoreItem>
+</file>
+
+<file path=customXml/itemProps2.xml><?xml version="1.0" encoding="utf-8"?>
+<ds:datastoreItem xmlns:ds="http://schemas.openxmlformats.org/officeDocument/2006/customXml" ds:itemID="{82B27FCD-4356-4E99-896E-1990AF331364}">
+  <ds:schemaRefs>
+    <ds:schemaRef ds:uri="http://schemas.microsoft.com/sharepoint/v3/contenttype/forms"/>
+  </ds:schemaRefs>
+</ds:datastoreItem>
+</file>
+
+<file path=customXml/itemProps3.xml><?xml version="1.0" encoding="utf-8"?>
 <ds:datastoreItem xmlns:ds="http://schemas.openxmlformats.org/officeDocument/2006/customXml" ds:itemID="{125922C5-D390-4582-8D5A-E24CDE930044}">
   <ds:schemaRefs>
     <ds:schemaRef ds:uri="http://schemas.microsoft.com/office/2006/metadata/contentType"/>
@@ -3796,34 +3789,8 @@
 </ds:datastoreItem>
 </file>
 
-<file path=customXml/itemProps2.xml><?xml version="1.0" encoding="utf-8"?>
-<ds:datastoreItem xmlns:ds="http://schemas.openxmlformats.org/officeDocument/2006/customXml" ds:itemID="{82B27FCD-4356-4E99-896E-1990AF331364}">
-  <ds:schemaRefs>
-    <ds:schemaRef ds:uri="http://schemas.microsoft.com/sharepoint/v3/contenttype/forms"/>
-  </ds:schemaRefs>
-</ds:datastoreItem>
-</file>
-
-<file path=customXml/itemProps3.xml><?xml version="1.0" encoding="utf-8"?>
-<ds:datastoreItem xmlns:ds="http://schemas.openxmlformats.org/officeDocument/2006/customXml" ds:itemID="{15B5EAE2-45C9-4001-88A9-4176EEA675B4}">
-  <ds:schemaRefs>
-    <ds:schemaRef ds:uri="http://www.w3.org/XML/1998/namespace"/>
-    <ds:schemaRef ds:uri="http://schemas.microsoft.com/office/infopath/2007/PartnerControls"/>
-    <ds:schemaRef ds:uri="http://schemas.microsoft.com/office/2006/documentManagement/types"/>
-    <ds:schemaRef ds:uri="http://schemas.microsoft.com/sharepoint/v3"/>
-    <ds:schemaRef ds:uri="http://schemas.microsoft.com/office/2006/metadata/properties"/>
-    <ds:schemaRef ds:uri="http://schemas.openxmlformats.org/package/2006/metadata/core-properties"/>
-    <ds:schemaRef ds:uri="http://purl.org/dc/terms/"/>
-    <ds:schemaRef ds:uri="http://purl.org/dc/dcmitype/"/>
-    <ds:schemaRef ds:uri="475903d6-5b88-4d7a-ba78-d123e191ef42"/>
-    <ds:schemaRef ds:uri="1be38a3c-13c4-46e0-8a29-91f320e906cc"/>
-    <ds:schemaRef ds:uri="http://purl.org/dc/elements/1.1/"/>
-  </ds:schemaRefs>
-</ds:datastoreItem>
-</file>
-
 <file path=customXml/itemProps4.xml><?xml version="1.0" encoding="utf-8"?>
-<ds:datastoreItem xmlns:ds="http://schemas.openxmlformats.org/officeDocument/2006/customXml" ds:itemID="{8BD1BE7E-2369-4A45-BF61-694DF2FC0FC7}">
+<ds:datastoreItem xmlns:ds="http://schemas.openxmlformats.org/officeDocument/2006/customXml" ds:itemID="{3454A205-8164-4E95-BC26-452CA6CD8D2D}">
   <ds:schemaRefs>
     <ds:schemaRef ds:uri="http://schemas.openxmlformats.org/officeDocument/2006/bibliography"/>
   </ds:schemaRefs>

</xml_diff>